<commit_message>
add: implementati test plan per la parte dei servizi task
</commit_message>
<xml_diff>
--- a/Workspace/Testing/Test cases/punti_singoli/Test_cases_specification.docx
+++ b/Workspace/Testing/Test cases/punti_singoli/Test_cases_specification.docx
@@ -330,10 +330,7 @@
           </w:tcPr>
           <w:p>
             <w:r>
-              <w:t>TC_</w:t>
-            </w:r>
-            <w:r>
-              <w:t>2</w:t>
+              <w:t>TC_2</w:t>
             </w:r>
           </w:p>
         </w:tc>
@@ -354,10 +351,7 @@
           </w:tcPr>
           <w:p>
             <w:r>
-              <w:t>TF_1.</w:t>
-            </w:r>
-            <w:r>
-              <w:t>2</w:t>
+              <w:t>TF_1.2</w:t>
             </w:r>
           </w:p>
         </w:tc>
@@ -610,10 +604,7 @@
           </w:tcPr>
           <w:p>
             <w:r>
-              <w:t>TC_</w:t>
-            </w:r>
-            <w:r>
-              <w:t>3</w:t>
+              <w:t>TC_3</w:t>
             </w:r>
           </w:p>
         </w:tc>
@@ -634,10 +625,7 @@
           </w:tcPr>
           <w:p>
             <w:r>
-              <w:t>TF_1.</w:t>
-            </w:r>
-            <w:r>
-              <w:t>3</w:t>
+              <w:t>TF_1.3</w:t>
             </w:r>
           </w:p>
         </w:tc>
@@ -736,10 +724,7 @@
                 </w:tcPr>
                 <w:p>
                   <w:r>
-                    <w:t>utentenonregistrato</w:t>
-                  </w:r>
-                  <w:r>
-                    <w:t>@azienda.it</w:t>
+                    <w:t>utentenonregistrato@azienda.it</w:t>
                   </w:r>
                 </w:p>
               </w:tc>
@@ -856,10 +841,7 @@
           </w:tcPr>
           <w:p>
             <w:r>
-              <w:t>TC_</w:t>
-            </w:r>
-            <w:r>
-              <w:t>4</w:t>
+              <w:t>TC_4</w:t>
             </w:r>
           </w:p>
         </w:tc>
@@ -880,10 +862,7 @@
           </w:tcPr>
           <w:p>
             <w:r>
-              <w:t>TF_1.</w:t>
-            </w:r>
-            <w:r>
-              <w:t>4</w:t>
+              <w:t>TF_1.4</w:t>
             </w:r>
           </w:p>
         </w:tc>
@@ -1053,16 +1032,7 @@
           </w:tcPr>
           <w:p>
             <w:r>
-              <w:t>L’utente non viene autenticato</w:t>
-            </w:r>
-            <w:r>
-              <w:t xml:space="preserve"> poiché</w:t>
-            </w:r>
-            <w:r>
-              <w:t xml:space="preserve"> </w:t>
-            </w:r>
-            <w:r>
-              <w:t>il campo username/e-mail è vuoto.</w:t>
+              <w:t>L’utente non viene autenticato poiché il campo username/e-mail è vuoto.</w:t>
             </w:r>
           </w:p>
           <w:p>
@@ -1073,18 +1043,12 @@
               <w:t>messaggio “</w:t>
             </w:r>
             <w:r>
-              <w:t>il campo username/e-mail è obbligatorio</w:t>
-            </w:r>
-            <w:r>
-              <w:t>”</w:t>
-            </w:r>
-          </w:p>
-          <w:p>
-            <w:r>
-              <w:t>(</w:t>
-            </w:r>
-            <w:r>
-              <w:t xml:space="preserve">e-mail </w:t>
+              <w:t>il campo username/e-mail è obbligatorio”</w:t>
+            </w:r>
+          </w:p>
+          <w:p>
+            <w:r>
+              <w:t xml:space="preserve">(e-mail </w:t>
             </w:r>
             <w:r>
               <w:t>nulla</w:t>
@@ -1173,10 +1137,7 @@
           </w:tcPr>
           <w:p>
             <w:r>
-              <w:t>TC_</w:t>
-            </w:r>
-            <w:r>
-              <w:t>5</w:t>
+              <w:t>TC_5</w:t>
             </w:r>
           </w:p>
         </w:tc>
@@ -1197,10 +1158,7 @@
           </w:tcPr>
           <w:p>
             <w:r>
-              <w:t>TF_1.</w:t>
-            </w:r>
-            <w:r>
-              <w:t>5</w:t>
+              <w:t>TF_1.5</w:t>
             </w:r>
           </w:p>
         </w:tc>
@@ -1299,10 +1257,7 @@
                 </w:tcPr>
                 <w:p>
                   <w:r>
-                    <w:t>mariorossi</w:t>
-                  </w:r>
-                  <w:r>
-                    <w:t>@azienda.it</w:t>
+                    <w:t>mariorossi@azienda.it</w:t>
                   </w:r>
                 </w:p>
               </w:tc>
@@ -1368,10 +1323,7 @@
           </w:tcPr>
           <w:p>
             <w:r>
-              <w:t xml:space="preserve">L’utente non viene autenticato poiché </w:t>
-            </w:r>
-            <w:r>
-              <w:t>il campo password è vuoto.</w:t>
+              <w:t>L’utente non viene autenticato poiché il campo password è vuoto.</w:t>
             </w:r>
           </w:p>
           <w:p>
@@ -1423,10 +1375,7 @@
           </w:tcPr>
           <w:p>
             <w:r>
-              <w:t>TC_</w:t>
-            </w:r>
-            <w:r>
-              <w:t>6</w:t>
+              <w:t>TC_6</w:t>
             </w:r>
           </w:p>
         </w:tc>
@@ -1447,10 +1396,7 @@
           </w:tcPr>
           <w:p>
             <w:r>
-              <w:t>TF_1.</w:t>
-            </w:r>
-            <w:r>
-              <w:t>6</w:t>
+              <w:t>TF_1.6</w:t>
             </w:r>
           </w:p>
         </w:tc>
@@ -1626,10 +1572,7 @@
           </w:tcPr>
           <w:p>
             <w:r>
-              <w:t xml:space="preserve">L’utente non viene autenticato poiché </w:t>
-            </w:r>
-            <w:r>
-              <w:t>il formato della e-mail inserita non è valido.</w:t>
+              <w:t>L’utente non viene autenticato poiché il formato della e-mail inserita non è valido.</w:t>
             </w:r>
           </w:p>
           <w:p>
@@ -1759,10 +1702,7 @@
           </w:tcPr>
           <w:p>
             <w:r>
-              <w:t>TC_</w:t>
-            </w:r>
-            <w:r>
-              <w:t>7</w:t>
+              <w:t>TC_7</w:t>
             </w:r>
           </w:p>
         </w:tc>
@@ -1783,10 +1723,7 @@
           </w:tcPr>
           <w:p>
             <w:r>
-              <w:t>TF_</w:t>
-            </w:r>
-            <w:r>
-              <w:t>2.1</w:t>
+              <w:t>TF_2.1</w:t>
             </w:r>
           </w:p>
         </w:tc>
@@ -2085,10 +2022,7 @@
           </w:tcPr>
           <w:p>
             <w:r>
-              <w:t>TC_</w:t>
-            </w:r>
-            <w:r>
-              <w:t>8</w:t>
+              <w:t>TC_8</w:t>
             </w:r>
           </w:p>
         </w:tc>
@@ -2109,10 +2043,7 @@
           </w:tcPr>
           <w:p>
             <w:r>
-              <w:t>TF_2.</w:t>
-            </w:r>
-            <w:r>
-              <w:t>2</w:t>
+              <w:t>TF_2.2</w:t>
             </w:r>
           </w:p>
         </w:tc>
@@ -2147,13 +2078,7 @@
             </w:r>
             <w:proofErr w:type="spellEnd"/>
             <w:r>
-              <w:t xml:space="preserve"> “modifica password”</w:t>
-            </w:r>
-            <w:r>
-              <w:t xml:space="preserve"> sulla sua pagina profilo</w:t>
-            </w:r>
-            <w:r>
-              <w:t>, si trova sulla pagina di cambio password</w:t>
+              <w:t xml:space="preserve"> “modifica password” sulla sua pagina profilo, si trova sulla pagina di cambio password</w:t>
             </w:r>
           </w:p>
         </w:tc>
@@ -2412,10 +2337,7 @@
           </w:tcPr>
           <w:p>
             <w:r>
-              <w:t>TC_</w:t>
-            </w:r>
-            <w:r>
-              <w:t>9</w:t>
+              <w:t>TC_9</w:t>
             </w:r>
           </w:p>
         </w:tc>
@@ -2436,10 +2358,7 @@
           </w:tcPr>
           <w:p>
             <w:r>
-              <w:t>TF_2.</w:t>
-            </w:r>
-            <w:r>
-              <w:t>3</w:t>
+              <w:t>TF_2.3</w:t>
             </w:r>
           </w:p>
         </w:tc>
@@ -2683,24 +2602,12 @@
           </w:tcPr>
           <w:p>
             <w:r>
-              <w:t>La password non viene aggiornata e viene mostrato il messaggio “</w:t>
-            </w:r>
-            <w:r>
-              <w:t>Le nuove password inserite non coincidono</w:t>
-            </w:r>
-            <w:r>
-              <w:t>”</w:t>
-            </w:r>
-          </w:p>
-          <w:p>
-            <w:r>
-              <w:t xml:space="preserve">(password </w:t>
-            </w:r>
-            <w:r>
-              <w:t>differenti</w:t>
-            </w:r>
-            <w:r>
-              <w:t>)</w:t>
+              <w:t>La password non viene aggiornata e viene mostrato il messaggio “Le nuove password inserite non coincidono”</w:t>
+            </w:r>
+          </w:p>
+          <w:p>
+            <w:r>
+              <w:t>(password differenti)</w:t>
             </w:r>
           </w:p>
         </w:tc>
@@ -2744,10 +2651,7 @@
           </w:tcPr>
           <w:p>
             <w:r>
-              <w:t>TC_</w:t>
-            </w:r>
-            <w:r>
-              <w:t>10</w:t>
+              <w:t>TC_10</w:t>
             </w:r>
           </w:p>
         </w:tc>
@@ -2768,10 +2672,7 @@
           </w:tcPr>
           <w:p>
             <w:r>
-              <w:t>TF_2.</w:t>
-            </w:r>
-            <w:r>
-              <w:t>4</w:t>
+              <w:t>TF_2.4</w:t>
             </w:r>
           </w:p>
         </w:tc>
@@ -3019,33 +2920,12 @@
           </w:tcPr>
           <w:p>
             <w:r>
-              <w:t>La password non viene aggiornata e viene mostrato il messaggio “L</w:t>
-            </w:r>
-            <w:r>
-              <w:t>a</w:t>
-            </w:r>
-            <w:r>
-              <w:t xml:space="preserve"> nuov</w:t>
-            </w:r>
-            <w:r>
-              <w:t>a</w:t>
-            </w:r>
-            <w:r>
-              <w:t xml:space="preserve"> password </w:t>
-            </w:r>
-            <w:r>
-              <w:t>non è sufficientemente corretta</w:t>
-            </w:r>
-            <w:r>
-              <w:t>”</w:t>
-            </w:r>
-          </w:p>
-          <w:p>
-            <w:r>
-              <w:t>(formato password invalido</w:t>
-            </w:r>
-            <w:r>
-              <w:t>)</w:t>
+              <w:t>La password non viene aggiornata e viene mostrato il messaggio “La nuova password non è sufficientemente corretta”</w:t>
+            </w:r>
+          </w:p>
+          <w:p>
+            <w:r>
+              <w:t>(formato password invalido)</w:t>
             </w:r>
           </w:p>
         </w:tc>
@@ -3097,10 +2977,7 @@
           </w:tcPr>
           <w:p>
             <w:r>
-              <w:t>TC_1</w:t>
-            </w:r>
-            <w:r>
-              <w:t>1</w:t>
+              <w:t>TC_11</w:t>
             </w:r>
           </w:p>
         </w:tc>
@@ -3121,10 +2998,7 @@
           </w:tcPr>
           <w:p>
             <w:r>
-              <w:t>TF_2.</w:t>
-            </w:r>
-            <w:r>
-              <w:t>5</w:t>
+              <w:t>TF_2.5</w:t>
             </w:r>
           </w:p>
         </w:tc>
@@ -3364,24 +3238,12 @@
           </w:tcPr>
           <w:p>
             <w:r>
-              <w:t>La password non viene aggiornata e viene mostrato il messaggio “</w:t>
-            </w:r>
-            <w:r>
-              <w:t>Il campo ‘password attuale’ è obbligatorio</w:t>
-            </w:r>
-            <w:r>
-              <w:t>”</w:t>
-            </w:r>
-          </w:p>
-          <w:p>
-            <w:r>
-              <w:t>(</w:t>
-            </w:r>
-            <w:r>
-              <w:t>password attuale nulla</w:t>
-            </w:r>
-            <w:r>
-              <w:t>)</w:t>
+              <w:t>La password non viene aggiornata e viene mostrato il messaggio “Il campo ‘password attuale’ è obbligatorio”</w:t>
+            </w:r>
+          </w:p>
+          <w:p>
+            <w:r>
+              <w:t>(password attuale nulla)</w:t>
             </w:r>
           </w:p>
         </w:tc>
@@ -3550,10 +3412,7 @@
           </w:tcPr>
           <w:p>
             <w:r>
-              <w:t>TC_1</w:t>
-            </w:r>
-            <w:r>
-              <w:t>2</w:t>
+              <w:t>TC_12</w:t>
             </w:r>
           </w:p>
         </w:tc>
@@ -3574,10 +3433,7 @@
           </w:tcPr>
           <w:p>
             <w:r>
-              <w:t>TF_</w:t>
-            </w:r>
-            <w:r>
-              <w:t>3.1</w:t>
+              <w:t>TF_3.1</w:t>
             </w:r>
           </w:p>
         </w:tc>
@@ -3787,10 +3643,7 @@
             </w:r>
             <w:proofErr w:type="spellEnd"/>
             <w:r>
-              <w:t xml:space="preserve"> di conferma per assicurarsi che </w:t>
-            </w:r>
-            <w:r>
-              <w:t>il supervisore voglia creare una nuova task</w:t>
+              <w:t xml:space="preserve"> di conferma per assicurarsi che il supervisore voglia creare una nuova task</w:t>
             </w:r>
           </w:p>
           <w:p>
@@ -3876,10 +3729,7 @@
           </w:tcPr>
           <w:p>
             <w:r>
-              <w:t>TC_1</w:t>
-            </w:r>
-            <w:r>
-              <w:t>3</w:t>
+              <w:t>TC_13</w:t>
             </w:r>
           </w:p>
         </w:tc>
@@ -3900,10 +3750,7 @@
           </w:tcPr>
           <w:p>
             <w:r>
-              <w:t>TF_3.</w:t>
-            </w:r>
-            <w:r>
-              <w:t>2</w:t>
+              <w:t>TF_3.2</w:t>
             </w:r>
           </w:p>
         </w:tc>
@@ -4160,13 +4007,7 @@
           </w:tcPr>
           <w:p>
             <w:r>
-              <w:t>Il task viene creato con successo e viene mostrato il messaggio “Task creato con successo</w:t>
-            </w:r>
-            <w:r>
-              <w:t>, allegato salvato correttamente</w:t>
-            </w:r>
-            <w:r>
-              <w:t>”.</w:t>
+              <w:t>Il task viene creato con successo e viene mostrato il messaggio “Task creato con successo, allegato salvato correttamente”.</w:t>
             </w:r>
           </w:p>
           <w:p>
@@ -4210,10 +4051,7 @@
           </w:tcPr>
           <w:p>
             <w:r>
-              <w:t>TC_1</w:t>
-            </w:r>
-            <w:r>
-              <w:t>4</w:t>
+              <w:t>TC_14</w:t>
             </w:r>
           </w:p>
         </w:tc>
@@ -4234,10 +4072,7 @@
           </w:tcPr>
           <w:p>
             <w:r>
-              <w:t>TF_3.</w:t>
-            </w:r>
-            <w:r>
-              <w:t>3</w:t>
+              <w:t>TF_3.3</w:t>
             </w:r>
           </w:p>
         </w:tc>
@@ -4537,10 +4372,7 @@
           </w:tcPr>
           <w:p>
             <w:r>
-              <w:t>TC_1</w:t>
-            </w:r>
-            <w:r>
-              <w:t>5</w:t>
+              <w:t>TC_15</w:t>
             </w:r>
           </w:p>
         </w:tc>
@@ -4561,10 +4393,7 @@
           </w:tcPr>
           <w:p>
             <w:r>
-              <w:t>TF_3.</w:t>
-            </w:r>
-            <w:r>
-              <w:t>4</w:t>
+              <w:t>TF_3.4</w:t>
             </w:r>
           </w:p>
         </w:tc>
@@ -4813,24 +4642,12 @@
           </w:tcPr>
           <w:p>
             <w:r>
-              <w:t>L’operazione ha esito negativo e viene mostrato il messaggio “</w:t>
-            </w:r>
-            <w:r>
-              <w:t>Per favore scegliere un dipendente</w:t>
-            </w:r>
-            <w:r>
-              <w:t>”.</w:t>
-            </w:r>
-          </w:p>
-          <w:p>
-            <w:r>
-              <w:t>(</w:t>
-            </w:r>
-            <w:r>
-              <w:t>dipendente</w:t>
-            </w:r>
-            <w:r>
-              <w:t xml:space="preserve"> nullo)</w:t>
+              <w:t>L’operazione ha esito negativo e viene mostrato il messaggio “Per favore scegliere un dipendente”.</w:t>
+            </w:r>
+          </w:p>
+          <w:p>
+            <w:r>
+              <w:t>(dipendente nullo)</w:t>
             </w:r>
           </w:p>
         </w:tc>
@@ -4872,10 +4689,7 @@
           </w:tcPr>
           <w:p>
             <w:r>
-              <w:t>TC_1</w:t>
-            </w:r>
-            <w:r>
-              <w:t>6</w:t>
+              <w:t>TC_16</w:t>
             </w:r>
           </w:p>
         </w:tc>
@@ -4896,10 +4710,7 @@
           </w:tcPr>
           <w:p>
             <w:r>
-              <w:t>TF_3.</w:t>
-            </w:r>
-            <w:r>
-              <w:t>5</w:t>
+              <w:t>TF_3.5</w:t>
             </w:r>
           </w:p>
         </w:tc>
@@ -5152,24 +4963,12 @@
           </w:tcPr>
           <w:p>
             <w:r>
-              <w:t>L’operazione ha esito negativo e viene mostrato il messaggio “</w:t>
-            </w:r>
-            <w:r>
-              <w:t>Data di scadenza obbligatoria e in formato valido</w:t>
-            </w:r>
-            <w:r>
-              <w:t>”.</w:t>
-            </w:r>
-          </w:p>
-          <w:p>
-            <w:r>
-              <w:t>(d</w:t>
-            </w:r>
-            <w:r>
-              <w:t>ata di scadenza passata o in formato errato</w:t>
-            </w:r>
-            <w:r>
-              <w:t>)</w:t>
+              <w:t>L’operazione ha esito negativo e viene mostrato il messaggio “Data di scadenza obbligatoria e in formato valido”.</w:t>
+            </w:r>
+          </w:p>
+          <w:p>
+            <w:r>
+              <w:t>(data di scadenza passata o in formato errato)</w:t>
             </w:r>
           </w:p>
         </w:tc>
@@ -5207,10 +5006,7 @@
           </w:tcPr>
           <w:p>
             <w:r>
-              <w:t>TC_1</w:t>
-            </w:r>
-            <w:r>
-              <w:t>7</w:t>
+              <w:t>TC_17</w:t>
             </w:r>
           </w:p>
         </w:tc>
@@ -5231,10 +5027,7 @@
           </w:tcPr>
           <w:p>
             <w:r>
-              <w:t>TF_3.</w:t>
-            </w:r>
-            <w:r>
-              <w:t>6</w:t>
+              <w:t>TF_3.6</w:t>
             </w:r>
           </w:p>
         </w:tc>
@@ -5487,24 +5280,12 @@
           </w:tcPr>
           <w:p>
             <w:r>
-              <w:t>L’operazione ha esito negativo e viene mostrato il messaggio “</w:t>
-            </w:r>
-            <w:r>
-              <w:t>Inserire le istruzione (min. 10/max 2000 caratteri</w:t>
-            </w:r>
-            <w:r>
-              <w:t>”.</w:t>
-            </w:r>
-          </w:p>
-          <w:p>
-            <w:r>
-              <w:t>(</w:t>
-            </w:r>
-            <w:r>
-              <w:t>formato delle istruzioni invalido</w:t>
-            </w:r>
-            <w:r>
-              <w:t>)</w:t>
+              <w:t>L’operazione ha esito negativo e viene mostrato il messaggio “Inserire le istruzione (min. 10/max 2000 caratteri”.</w:t>
+            </w:r>
+          </w:p>
+          <w:p>
+            <w:r>
+              <w:t>(formato delle istruzioni invalido)</w:t>
             </w:r>
           </w:p>
         </w:tc>
@@ -5547,10 +5328,7 @@
           </w:tcPr>
           <w:p>
             <w:r>
-              <w:t>TC_1</w:t>
-            </w:r>
-            <w:r>
-              <w:t>8</w:t>
+              <w:t>TC_18</w:t>
             </w:r>
           </w:p>
         </w:tc>
@@ -5571,10 +5349,7 @@
           </w:tcPr>
           <w:p>
             <w:r>
-              <w:t>TF_3.</w:t>
-            </w:r>
-            <w:r>
-              <w:t>7</w:t>
+              <w:t>TF_3.7</w:t>
             </w:r>
           </w:p>
         </w:tc>
@@ -5764,10 +5539,7 @@
                 </w:tcPr>
                 <w:p>
                   <w:r>
-                    <w:t>Guidelines.</w:t>
-                  </w:r>
-                  <w:r>
-                    <w:t>wav</w:t>
+                    <w:t>Guidelines.wav</w:t>
                   </w:r>
                 </w:p>
               </w:tc>
@@ -5834,24 +5606,12 @@
           </w:tcPr>
           <w:p>
             <w:r>
-              <w:t>L’operazione ha esito negativo e viene mostrato il messaggio “</w:t>
-            </w:r>
-            <w:r>
-              <w:t>Estensione file non consentita</w:t>
-            </w:r>
-            <w:r>
-              <w:t>”.</w:t>
-            </w:r>
-          </w:p>
-          <w:p>
-            <w:r>
-              <w:t>(formato dell</w:t>
-            </w:r>
-            <w:r>
-              <w:t xml:space="preserve">’allegato </w:t>
-            </w:r>
-            <w:r>
-              <w:t>invalido)</w:t>
+              <w:t>L’operazione ha esito negativo e viene mostrato il messaggio “Estensione file non consentita”.</w:t>
+            </w:r>
+          </w:p>
+          <w:p>
+            <w:r>
+              <w:t>(formato dell’allegato invalido)</w:t>
             </w:r>
           </w:p>
         </w:tc>
@@ -5889,10 +5649,7 @@
           </w:tcPr>
           <w:p>
             <w:r>
-              <w:t>TC_1</w:t>
-            </w:r>
-            <w:r>
-              <w:t>9</w:t>
+              <w:t>TC_19</w:t>
             </w:r>
           </w:p>
         </w:tc>
@@ -5913,10 +5670,7 @@
           </w:tcPr>
           <w:p>
             <w:r>
-              <w:t>TF_3.</w:t>
-            </w:r>
-            <w:r>
-              <w:t>8</w:t>
+              <w:t>TF_3.8</w:t>
             </w:r>
           </w:p>
         </w:tc>
@@ -6106,10 +5860,7 @@
                 </w:tcPr>
                 <w:p>
                   <w:r>
-                    <w:t>Guidelines.</w:t>
-                  </w:r>
-                  <w:r>
-                    <w:t>xlsx (15 MB)</w:t>
+                    <w:t>Guidelines.xlsx (15 MB)</w:t>
                   </w:r>
                 </w:p>
               </w:tc>
@@ -6176,13 +5927,7 @@
           </w:tcPr>
           <w:p>
             <w:r>
-              <w:t>L’operazione ha esito negativo e viene mostrato il messaggio “</w:t>
-            </w:r>
-            <w:r>
-              <w:t>Il file supera la dimensione massima</w:t>
-            </w:r>
-            <w:r>
-              <w:t>”.</w:t>
+              <w:t>L’operazione ha esito negativo e viene mostrato il messaggio “Il file supera la dimensione massima”.</w:t>
             </w:r>
           </w:p>
           <w:p>
@@ -6254,10 +5999,7 @@
           </w:tcPr>
           <w:p>
             <w:r>
-              <w:t>TC_</w:t>
-            </w:r>
-            <w:r>
-              <w:t>20</w:t>
+              <w:t>TC_20</w:t>
             </w:r>
           </w:p>
         </w:tc>
@@ -6278,10 +6020,7 @@
           </w:tcPr>
           <w:p>
             <w:r>
-              <w:t>TF_</w:t>
-            </w:r>
-            <w:r>
-              <w:t>4.1</w:t>
+              <w:t>TF_4.1</w:t>
             </w:r>
           </w:p>
         </w:tc>
@@ -6454,10 +6193,7 @@
             </w:r>
             <w:proofErr w:type="spellEnd"/>
             <w:r>
-              <w:t xml:space="preserve"> di conferma per assicurarsi che </w:t>
-            </w:r>
-            <w:r>
-              <w:t>l’utente voglia sospendere il task</w:t>
+              <w:t xml:space="preserve"> di conferma per assicurarsi che l’utente voglia sospendere il task</w:t>
             </w:r>
           </w:p>
           <w:p>
@@ -6544,10 +6280,7 @@
           </w:tcPr>
           <w:p>
             <w:r>
-              <w:t>TC_2</w:t>
-            </w:r>
-            <w:r>
-              <w:t>1</w:t>
+              <w:t>TC_21</w:t>
             </w:r>
           </w:p>
         </w:tc>
@@ -6568,10 +6301,7 @@
           </w:tcPr>
           <w:p>
             <w:r>
-              <w:t>TF_4.</w:t>
-            </w:r>
-            <w:r>
-              <w:t>2</w:t>
+              <w:t>TF_4.2</w:t>
             </w:r>
           </w:p>
         </w:tc>
@@ -6886,10 +6616,7 @@
           </w:tcPr>
           <w:p>
             <w:r>
-              <w:t>TC_2</w:t>
-            </w:r>
-            <w:r>
-              <w:t>2</w:t>
+              <w:t>TC_22</w:t>
             </w:r>
           </w:p>
         </w:tc>
@@ -6910,10 +6637,7 @@
           </w:tcPr>
           <w:p>
             <w:r>
-              <w:t>TF_4.</w:t>
-            </w:r>
-            <w:r>
-              <w:t>3</w:t>
+              <w:t>TF_4.3</w:t>
             </w:r>
           </w:p>
         </w:tc>
@@ -7125,21 +6849,12 @@
           </w:tcPr>
           <w:p>
             <w:r>
-              <w:t xml:space="preserve">L’operazione ha esito negativo e viene mostrato il messaggio </w:t>
-            </w:r>
-            <w:r>
-              <w:t>“possibilità di sospendere il task non disponibile”</w:t>
-            </w:r>
-          </w:p>
-          <w:p>
-            <w:r>
-              <w:t>(</w:t>
-            </w:r>
-            <w:r>
-              <w:t>task non sospendibile</w:t>
-            </w:r>
-            <w:r>
-              <w:t>)</w:t>
+              <w:t>L’operazione ha esito negativo e viene mostrato il messaggio “possibilità di sospendere il task non disponibile”</w:t>
+            </w:r>
+          </w:p>
+          <w:p>
+            <w:r>
+              <w:t>(task non sospendibile)</w:t>
             </w:r>
           </w:p>
         </w:tc>
@@ -7183,10 +6898,7 @@
           </w:tcPr>
           <w:p>
             <w:r>
-              <w:t>TC_2</w:t>
-            </w:r>
-            <w:r>
-              <w:t>3</w:t>
+              <w:t>TC_23</w:t>
             </w:r>
           </w:p>
         </w:tc>
@@ -7207,10 +6919,7 @@
           </w:tcPr>
           <w:p>
             <w:r>
-              <w:t>TF_4.</w:t>
-            </w:r>
-            <w:r>
-              <w:t>4</w:t>
+              <w:t>TF_4.4</w:t>
             </w:r>
           </w:p>
         </w:tc>
@@ -7528,10 +7237,7 @@
           </w:tcPr>
           <w:p>
             <w:r>
-              <w:t>TC_2</w:t>
-            </w:r>
-            <w:r>
-              <w:t>4</w:t>
+              <w:t>TC_24</w:t>
             </w:r>
           </w:p>
         </w:tc>
@@ -7552,10 +7258,7 @@
           </w:tcPr>
           <w:p>
             <w:r>
-              <w:t>TF_4.</w:t>
-            </w:r>
-            <w:r>
-              <w:t>5</w:t>
+              <w:t>TF_4.5</w:t>
             </w:r>
           </w:p>
         </w:tc>
@@ -7816,10 +7519,7 @@
           </w:tcPr>
           <w:p>
             <w:r>
-              <w:t>TC_2</w:t>
-            </w:r>
-            <w:r>
-              <w:t>5</w:t>
+              <w:t>TC_25</w:t>
             </w:r>
           </w:p>
         </w:tc>
@@ -7840,10 +7540,7 @@
           </w:tcPr>
           <w:p>
             <w:r>
-              <w:t>TF_4.</w:t>
-            </w:r>
-            <w:r>
-              <w:t>6</w:t>
+              <w:t>TF_4.6</w:t>
             </w:r>
           </w:p>
         </w:tc>
@@ -8055,24 +7752,12 @@
           </w:tcPr>
           <w:p>
             <w:r>
-              <w:t>L’operazione ha esito negativo e viene mostrato il messaggio “</w:t>
-            </w:r>
-            <w:r>
-              <w:t>Motivazione obbligatoria</w:t>
-            </w:r>
-            <w:r>
-              <w:t>”</w:t>
-            </w:r>
-          </w:p>
-          <w:p>
-            <w:r>
-              <w:t>(</w:t>
-            </w:r>
-            <w:r>
-              <w:t>motivazione nulla</w:t>
-            </w:r>
-            <w:r>
-              <w:t>)</w:t>
+              <w:t>L’operazione ha esito negativo e viene mostrato il messaggio “Motivazione obbligatoria”</w:t>
+            </w:r>
+          </w:p>
+          <w:p>
+            <w:r>
+              <w:t>(motivazione nulla)</w:t>
             </w:r>
           </w:p>
         </w:tc>
@@ -8205,10 +7890,7 @@
           </w:tcPr>
           <w:p>
             <w:r>
-              <w:t>TC_2</w:t>
-            </w:r>
-            <w:r>
-              <w:t>6</w:t>
+              <w:t>TC_26</w:t>
             </w:r>
           </w:p>
         </w:tc>
@@ -8229,10 +7911,7 @@
           </w:tcPr>
           <w:p>
             <w:r>
-              <w:t>TF_</w:t>
-            </w:r>
-            <w:r>
-              <w:t>5.1</w:t>
+              <w:t>TF_5.1</w:t>
             </w:r>
           </w:p>
         </w:tc>
@@ -8343,10 +8022,7 @@
                 </w:tcPr>
                 <w:p>
                   <w:r>
-                    <w:t xml:space="preserve">Cognome </w:t>
-                  </w:r>
-                  <w:r>
-                    <w:t xml:space="preserve"> </w:t>
+                    <w:t xml:space="preserve">Cognome  </w:t>
                   </w:r>
                 </w:p>
               </w:tc>
@@ -8430,13 +8106,8 @@
                 </w:tcPr>
                 <w:p>
                   <w:r>
-                    <w:t>Scarabeo</w:t>
-                  </w:r>
-                  <w:proofErr w:type="gramStart"/>
-                  <w:r>
-                    <w:t>96!*</w:t>
-                  </w:r>
-                  <w:proofErr w:type="gramEnd"/>
+                    <w:t>Scarabeo96!*</w:t>
+                  </w:r>
                 </w:p>
               </w:tc>
             </w:tr>
@@ -8459,10 +8130,7 @@
             </w:r>
             <w:proofErr w:type="spellEnd"/>
             <w:r>
-              <w:t xml:space="preserve"> di conferma per assicurarsi che </w:t>
-            </w:r>
-            <w:r>
-              <w:t>il gestore degli account voglia creare un nuovo account</w:t>
+              <w:t xml:space="preserve"> di conferma per assicurarsi che il gestore degli account voglia creare un nuovo account</w:t>
             </w:r>
           </w:p>
           <w:p>
@@ -8474,10 +8142,7 @@
               </w:numPr>
             </w:pPr>
             <w:r>
-              <w:t>Il gestore degli account</w:t>
-            </w:r>
-            <w:r>
-              <w:t xml:space="preserve"> conferma e attende l’esito</w:t>
+              <w:t>Il gestore degli account conferma e attende l’esito</w:t>
             </w:r>
           </w:p>
         </w:tc>
@@ -8508,10 +8173,7 @@
           </w:tcPr>
           <w:p>
             <w:r>
-              <w:t xml:space="preserve">L’operazione ha esito </w:t>
-            </w:r>
-            <w:r>
-              <w:t>positivo e l’account viene creato e salvato</w:t>
+              <w:t>L’operazione ha esito positivo e l’account viene creato e salvato</w:t>
             </w:r>
           </w:p>
           <w:p/>
@@ -8556,10 +8218,7 @@
           </w:tcPr>
           <w:p>
             <w:r>
-              <w:t>TC_2</w:t>
-            </w:r>
-            <w:r>
-              <w:t>7</w:t>
+              <w:t>TC_27</w:t>
             </w:r>
           </w:p>
         </w:tc>
@@ -8580,10 +8239,7 @@
           </w:tcPr>
           <w:p>
             <w:r>
-              <w:t>TF_5.</w:t>
-            </w:r>
-            <w:r>
-              <w:t>2</w:t>
+              <w:t>TF_5.2</w:t>
             </w:r>
           </w:p>
         </w:tc>
@@ -8778,13 +8434,8 @@
                 </w:tcPr>
                 <w:p>
                   <w:r>
-                    <w:t>Scarabeo</w:t>
-                  </w:r>
-                  <w:proofErr w:type="gramStart"/>
-                  <w:r>
-                    <w:t>96!*</w:t>
-                  </w:r>
-                  <w:proofErr w:type="gramEnd"/>
+                    <w:t>Scarabeo96!*</w:t>
+                  </w:r>
                 </w:p>
               </w:tc>
             </w:tr>
@@ -8850,10 +8501,7 @@
           </w:tcPr>
           <w:p>
             <w:r>
-              <w:t>L’operazione ha esito</w:t>
-            </w:r>
-            <w:r>
-              <w:t xml:space="preserve"> negativo e viene mostrato il messaggio “Indirizzo e-mail già utilizzato”</w:t>
+              <w:t>L’operazione ha esito negativo e viene mostrato il messaggio “Indirizzo e-mail già utilizzato”</w:t>
             </w:r>
           </w:p>
           <w:p>
@@ -8917,10 +8565,7 @@
           </w:tcPr>
           <w:p>
             <w:r>
-              <w:t>TC_2</w:t>
-            </w:r>
-            <w:r>
-              <w:t>8</w:t>
+              <w:t>TC_28</w:t>
             </w:r>
           </w:p>
         </w:tc>
@@ -8941,10 +8586,7 @@
           </w:tcPr>
           <w:p>
             <w:r>
-              <w:t>TF_5.</w:t>
-            </w:r>
-            <w:r>
-              <w:t>3</w:t>
+              <w:t>TF_5.3</w:t>
             </w:r>
           </w:p>
         </w:tc>
@@ -9135,13 +8777,8 @@
                 </w:tcPr>
                 <w:p>
                   <w:r>
-                    <w:t>Scarabeo</w:t>
-                  </w:r>
-                  <w:proofErr w:type="gramStart"/>
-                  <w:r>
-                    <w:t>96!*</w:t>
-                  </w:r>
-                  <w:proofErr w:type="gramEnd"/>
+                    <w:t>Scarabeo96!*</w:t>
+                  </w:r>
                 </w:p>
               </w:tc>
             </w:tr>
@@ -9207,16 +8844,7 @@
           </w:tcPr>
           <w:p>
             <w:r>
-              <w:t>L’operazione ha esito negativo e viene mostrato il messaggio “</w:t>
-            </w:r>
-            <w:r>
-              <w:t>Il campo ‘nome’ è obbligatorio</w:t>
-            </w:r>
-            <w:r>
-              <w:t>”</w:t>
-            </w:r>
-            <w:r>
-              <w:t>.</w:t>
+              <w:t>L’operazione ha esito negativo e viene mostrato il messaggio “Il campo ‘nome’ è obbligatorio”.</w:t>
             </w:r>
           </w:p>
           <w:p>
@@ -9265,10 +8893,7 @@
           </w:tcPr>
           <w:p>
             <w:r>
-              <w:t>TC_2</w:t>
-            </w:r>
-            <w:r>
-              <w:t>9</w:t>
+              <w:t>TC_29</w:t>
             </w:r>
           </w:p>
         </w:tc>
@@ -9289,10 +8914,7 @@
           </w:tcPr>
           <w:p>
             <w:r>
-              <w:t>TF_5.</w:t>
-            </w:r>
-            <w:r>
-              <w:t>4</w:t>
+              <w:t>TF_5.4</w:t>
             </w:r>
           </w:p>
         </w:tc>
@@ -9487,13 +9109,8 @@
                 </w:tcPr>
                 <w:p>
                   <w:r>
-                    <w:t>Scarabeo</w:t>
-                  </w:r>
-                  <w:proofErr w:type="gramStart"/>
-                  <w:r>
-                    <w:t>96!*</w:t>
-                  </w:r>
-                  <w:proofErr w:type="gramEnd"/>
+                    <w:t>Scarabeo96!*</w:t>
+                  </w:r>
                 </w:p>
               </w:tc>
             </w:tr>
@@ -9559,24 +9176,12 @@
           </w:tcPr>
           <w:p>
             <w:r>
-              <w:t>L’operazione ha esito negativo e viene mostrato il messaggio “</w:t>
-            </w:r>
-            <w:r>
-              <w:t>Formato data non valido</w:t>
-            </w:r>
-            <w:r>
-              <w:t>”.</w:t>
-            </w:r>
-          </w:p>
-          <w:p>
-            <w:r>
-              <w:t>(</w:t>
-            </w:r>
-            <w:r>
-              <w:t>formato data invalid</w:t>
-            </w:r>
-            <w:r>
-              <w:t>o)</w:t>
+              <w:t>L’operazione ha esito negativo e viene mostrato il messaggio “Formato data non valido”.</w:t>
+            </w:r>
+          </w:p>
+          <w:p>
+            <w:r>
+              <w:t>(formato data invalido)</w:t>
             </w:r>
           </w:p>
         </w:tc>
@@ -9649,10 +9254,7 @@
           </w:tcPr>
           <w:p>
             <w:r>
-              <w:t>TC_</w:t>
-            </w:r>
-            <w:r>
-              <w:t>30</w:t>
+              <w:t>TC_30</w:t>
             </w:r>
           </w:p>
         </w:tc>
@@ -9673,10 +9275,7 @@
           </w:tcPr>
           <w:p>
             <w:r>
-              <w:t>TF_5.</w:t>
-            </w:r>
-            <w:r>
-              <w:t>5</w:t>
+              <w:t>TF_5.5</w:t>
             </w:r>
           </w:p>
         </w:tc>
@@ -9867,13 +9466,8 @@
                 </w:tcPr>
                 <w:p>
                   <w:r>
-                    <w:t>Scarabeo</w:t>
-                  </w:r>
-                  <w:proofErr w:type="gramStart"/>
-                  <w:r>
-                    <w:t>96!*</w:t>
-                  </w:r>
-                  <w:proofErr w:type="gramEnd"/>
+                    <w:t>Scarabeo96!*</w:t>
+                  </w:r>
                 </w:p>
               </w:tc>
             </w:tr>
@@ -9939,10 +9533,7 @@
           </w:tcPr>
           <w:p>
             <w:r>
-              <w:t>L’operazione ha esito negativo e viene mostrato il messaggio “</w:t>
-            </w:r>
-            <w:r>
-              <w:t xml:space="preserve">Il campo ‘data di </w:t>
+              <w:t xml:space="preserve">L’operazione ha esito negativo e viene mostrato il messaggio “Il campo ‘data di </w:t>
             </w:r>
             <w:proofErr w:type="spellStart"/>
             <w:r>
@@ -9950,21 +9541,12 @@
             </w:r>
             <w:proofErr w:type="spellEnd"/>
             <w:r>
-              <w:t xml:space="preserve"> è obbligatorio</w:t>
-            </w:r>
-            <w:r>
-              <w:t>”.</w:t>
-            </w:r>
-          </w:p>
-          <w:p>
-            <w:r>
-              <w:t>(</w:t>
-            </w:r>
-            <w:r>
-              <w:t>data nulla</w:t>
-            </w:r>
-            <w:r>
-              <w:t>)</w:t>
+              <w:t xml:space="preserve"> è obbligatorio”.</w:t>
+            </w:r>
+          </w:p>
+          <w:p>
+            <w:r>
+              <w:t>(data nulla)</w:t>
             </w:r>
           </w:p>
         </w:tc>
@@ -10008,10 +9590,7 @@
           </w:tcPr>
           <w:p>
             <w:r>
-              <w:t>TC_3</w:t>
-            </w:r>
-            <w:r>
-              <w:t>1</w:t>
+              <w:t>TC_31</w:t>
             </w:r>
           </w:p>
         </w:tc>
@@ -10032,10 +9611,7 @@
           </w:tcPr>
           <w:p>
             <w:r>
-              <w:t>TF_5.</w:t>
-            </w:r>
-            <w:r>
-              <w:t>6</w:t>
+              <w:t>TF_5.6</w:t>
             </w:r>
           </w:p>
         </w:tc>
@@ -10206,31 +9782,7 @@
                       <w:rPr>
                         <w:rStyle w:val="Collegamentoipertestuale"/>
                       </w:rPr>
-                      <w:t>luigiverdi</w:t>
-                    </w:r>
-                    <w:r>
-                      <w:rPr>
-                        <w:rStyle w:val="Collegamentoipertestuale"/>
-                      </w:rPr>
-                      <w:t>.</w:t>
-                    </w:r>
-                    <w:r>
-                      <w:rPr>
-                        <w:rStyle w:val="Collegamentoipertestuale"/>
-                      </w:rPr>
-                      <w:t>azienda</w:t>
-                    </w:r>
-                    <w:r>
-                      <w:rPr>
-                        <w:rStyle w:val="Collegamentoipertestuale"/>
-                      </w:rPr>
-                      <w:t>@i</w:t>
-                    </w:r>
-                    <w:r>
-                      <w:rPr>
-                        <w:rStyle w:val="Collegamentoipertestuale"/>
-                      </w:rPr>
-                      <w:t>t</w:t>
+                      <w:t>luigiverdi.azienda@it</w:t>
                     </w:r>
                   </w:hyperlink>
                 </w:p>
@@ -10254,13 +9806,8 @@
                 </w:tcPr>
                 <w:p>
                   <w:r>
-                    <w:t>Scarabeo</w:t>
-                  </w:r>
-                  <w:proofErr w:type="gramStart"/>
-                  <w:r>
-                    <w:t>96!*</w:t>
-                  </w:r>
-                  <w:proofErr w:type="gramEnd"/>
+                    <w:t>Scarabeo96!*</w:t>
+                  </w:r>
                 </w:p>
               </w:tc>
             </w:tr>
@@ -10326,24 +9873,12 @@
           </w:tcPr>
           <w:p>
             <w:r>
-              <w:t>L’operazione ha esito negativo e viene mostrato il messaggio “</w:t>
-            </w:r>
-            <w:r>
-              <w:t>Il formato della e-mail non è valido</w:t>
-            </w:r>
-            <w:r>
-              <w:t>”.</w:t>
-            </w:r>
-          </w:p>
-          <w:p>
-            <w:r>
-              <w:t>(</w:t>
-            </w:r>
-            <w:r>
-              <w:t>formato e-mail invalido</w:t>
-            </w:r>
-            <w:r>
-              <w:t>)</w:t>
+              <w:t>L’operazione ha esito negativo e viene mostrato il messaggio “Il formato della e-mail non è valido”.</w:t>
+            </w:r>
+          </w:p>
+          <w:p>
+            <w:r>
+              <w:t>(formato e-mail invalido)</w:t>
             </w:r>
           </w:p>
         </w:tc>
@@ -10416,10 +9951,7 @@
           </w:tcPr>
           <w:p>
             <w:r>
-              <w:t>TC_3</w:t>
-            </w:r>
-            <w:r>
-              <w:t>2</w:t>
+              <w:t>TC_32</w:t>
             </w:r>
           </w:p>
         </w:tc>
@@ -10440,10 +9972,7 @@
           </w:tcPr>
           <w:p>
             <w:r>
-              <w:t>TF_5.</w:t>
-            </w:r>
-            <w:r>
-              <w:t>7</w:t>
+              <w:t>TF_5.7</w:t>
             </w:r>
           </w:p>
         </w:tc>
@@ -10701,24 +10230,12 @@
           </w:tcPr>
           <w:p>
             <w:r>
-              <w:t xml:space="preserve">L’operazione ha esito negativo e viene mostrato il messaggio “Il </w:t>
-            </w:r>
-            <w:r>
-              <w:t>campo ‘password’ è obbligatorio</w:t>
-            </w:r>
-            <w:r>
-              <w:t>”.</w:t>
-            </w:r>
-          </w:p>
-          <w:p>
-            <w:r>
-              <w:t>(</w:t>
-            </w:r>
-            <w:r>
-              <w:t>password nulla</w:t>
-            </w:r>
-            <w:r>
-              <w:t>)</w:t>
+              <w:t>L’operazione ha esito negativo e viene mostrato il messaggio “Il campo ‘password’ è obbligatorio”.</w:t>
+            </w:r>
+          </w:p>
+          <w:p>
+            <w:r>
+              <w:t>(password nulla)</w:t>
             </w:r>
           </w:p>
         </w:tc>
@@ -10762,10 +10279,7 @@
           </w:tcPr>
           <w:p>
             <w:r>
-              <w:t>TC_3</w:t>
-            </w:r>
-            <w:r>
-              <w:t>3</w:t>
+              <w:t>TC_33</w:t>
             </w:r>
           </w:p>
         </w:tc>
@@ -10786,10 +10300,7 @@
           </w:tcPr>
           <w:p>
             <w:r>
-              <w:t>TF_5.</w:t>
-            </w:r>
-            <w:r>
-              <w:t>8</w:t>
+              <w:t>TF_5.8</w:t>
             </w:r>
           </w:p>
         </w:tc>
@@ -10984,13 +10495,8 @@
                 </w:tcPr>
                 <w:p>
                   <w:r>
-                    <w:t>Scarabeo</w:t>
-                  </w:r>
-                  <w:proofErr w:type="gramStart"/>
-                  <w:r>
-                    <w:t>96!*</w:t>
-                  </w:r>
-                  <w:proofErr w:type="gramEnd"/>
+                    <w:t>Scarabeo96!*</w:t>
+                  </w:r>
                 </w:p>
               </w:tc>
             </w:tr>
@@ -11056,24 +10562,12 @@
           </w:tcPr>
           <w:p>
             <w:r>
-              <w:t>L’operazione ha esito negativo e viene mostrato il messaggio “</w:t>
-            </w:r>
-            <w:r>
-              <w:t>Nome troppo lungo (max. 50 caratteri</w:t>
-            </w:r>
-            <w:r>
-              <w:t>”.</w:t>
-            </w:r>
-          </w:p>
-          <w:p>
-            <w:r>
-              <w:t>(</w:t>
-            </w:r>
-            <w:r>
-              <w:t>formato nome invalido</w:t>
-            </w:r>
-            <w:r>
-              <w:t>)</w:t>
+              <w:t>L’operazione ha esito negativo e viene mostrato il messaggio “Nome troppo lungo (max. 50 caratteri”.</w:t>
+            </w:r>
+          </w:p>
+          <w:p>
+            <w:r>
+              <w:t>(formato nome invalido)</w:t>
             </w:r>
           </w:p>
         </w:tc>
@@ -11139,10 +10633,7 @@
           </w:tcPr>
           <w:p>
             <w:r>
-              <w:t>TC_3</w:t>
-            </w:r>
-            <w:r>
-              <w:t>4</w:t>
+              <w:t>TC_34</w:t>
             </w:r>
           </w:p>
         </w:tc>
@@ -11163,10 +10654,7 @@
           </w:tcPr>
           <w:p>
             <w:r>
-              <w:t>TF_5.</w:t>
-            </w:r>
-            <w:r>
-              <w:t>9</w:t>
+              <w:t>TF_5.9</w:t>
             </w:r>
           </w:p>
         </w:tc>
@@ -11357,13 +10845,8 @@
                 </w:tcPr>
                 <w:p>
                   <w:r>
-                    <w:t>Scarabeo</w:t>
-                  </w:r>
-                  <w:proofErr w:type="gramStart"/>
-                  <w:r>
-                    <w:t>96!*</w:t>
-                  </w:r>
-                  <w:proofErr w:type="gramEnd"/>
+                    <w:t>Scarabeo96!*</w:t>
+                  </w:r>
                 </w:p>
               </w:tc>
             </w:tr>
@@ -11429,24 +10912,12 @@
           </w:tcPr>
           <w:p>
             <w:r>
-              <w:t>L’operazione ha esito negativo e viene mostrato il messaggio “</w:t>
-            </w:r>
-            <w:r>
-              <w:t>il campo ‘cognome’ è obbligatorio</w:t>
-            </w:r>
-            <w:r>
-              <w:t>”.</w:t>
-            </w:r>
-          </w:p>
-          <w:p>
-            <w:r>
-              <w:t>(</w:t>
-            </w:r>
-            <w:r>
-              <w:t>cognome nullo</w:t>
-            </w:r>
-            <w:r>
-              <w:t>)</w:t>
+              <w:t>L’operazione ha esito negativo e viene mostrato il messaggio “il campo ‘cognome’ è obbligatorio”.</w:t>
+            </w:r>
+          </w:p>
+          <w:p>
+            <w:r>
+              <w:t>(cognome nullo)</w:t>
             </w:r>
           </w:p>
         </w:tc>

</xml_diff>